<commit_message>
documentation tidy-up: formatting consistency across docs and deliverables
</commit_message>
<xml_diff>
--- a/docs/Samuel_Kaoma 2022016530_para data proposal.docx
+++ b/docs/Samuel_Kaoma 2022016530_para data proposal.docx
@@ -776,10 +776,10 @@
         <w:t xml:space="preserve"> and ODK platforms. The system ingests raw audit logs, parses platform-specific formats into a common intermediate</w:t>
       </w:r>
       <w:r>
-        <w:t xml:space="preserve"> representation, and applies a structured feature extraction pipeline to compute over thirty timing-based indicators spanning question-level, section-level, and survey-level granularities. Statistical measures — including entropy, variance, skewness, and k</w:t>
-      </w:r>
-      <w:r>
-        <w:t xml:space="preserve">urtosis — </w:t>
+        <w:t xml:space="preserve"> representation, and applies a structured feature extraction pipeline to compute over thirty timing-based indicators spanning question-level, section-level, and survey-level granularities. Statistical measures, including entropy, variance, skewness, and k</w:t>
+      </w:r>
+      <w:r>
+        <w:t xml:space="preserve">urtosis, </w:t>
       </w:r>
       <w:r>
         <w:t>characterize</w:t>
@@ -788,7 +788,7 @@
         <w:t xml:space="preserve"> response distributions, while Interquartile Range (IQR) thresholding and rule-based logic identify anomalous interview patterns. Validation is conducted using synthetic datasets with injected anomalies, evaluated against precision, r</w:t>
       </w:r>
       <w:r>
-        <w:t>ecall, and effect-size criteria. The outcome is a reproducible Python feature library, accompanying paradata format documentation, and an empirical validation report — providing a practical bridge between theoretical survey methodology research and scalabl</w:t>
+        <w:t>ecall, and effect-size criteria. The outcome is a reproducible Python feature library, accompanying paradata format documentation, and an empirical validation report, providing a practical bridge between theoretical survey methodology research and scalabl</w:t>
       </w:r>
       <w:r>
         <w:t>e quality assurance implementation.</w:t>
@@ -824,7 +824,7 @@
         <w:t xml:space="preserve"> and Open Data Kit (ODK) have substantially i</w:t>
       </w:r>
       <w:r>
-        <w:t>mproved the efficiency of field survey administration. Both platforms automatically record auxiliary data — commonly referred to as paradata — that captures detailed information about how interviews are conducted rather than the responses themselves.</w:t>
+        <w:t>mproved the efficiency of field survey administration. Both platforms automatically record auxiliary data, commonly referred to as paradata, that captures detailed information about how interviews are conducted rather than the responses themselves.</w:t>
       </w:r>
     </w:p>
     <w:p>
@@ -883,7 +883,7 @@
         <w:t xml:space="preserve"> and ODK differ in structure, field naming conventions, and granularity, making cross-platform analysis non-trivial. Existing quality assu</w:t>
       </w:r>
       <w:r>
-        <w:t xml:space="preserve">rance approaches largely depend on aggregate indicators such as total interview duration or manual back-check supervision — methods that are poorly equipped to detect subtle </w:t>
+        <w:t xml:space="preserve">rance approaches largely depend on aggregate indicators such as total interview duration or manual back-check supervision, methods that are poorly equipped to detect subtle </w:t>
       </w:r>
       <w:r>
         <w:t>behavioral</w:t>
@@ -904,7 +904,7 @@
         <w:t>veloping an automated, platform-agnostic pipeline that extracts, structures, and analyses timing-based paradata features. By combining data engineering techniques with statistical anomaly detection, the system transforms raw logs into structured datasets s</w:t>
       </w:r>
       <w:r>
-        <w:t xml:space="preserve">uitable for quality assessment — </w:t>
+        <w:t xml:space="preserve">uitable for quality assessment, </w:t>
       </w:r>
       <w:r>
         <w:t>operationalizing</w:t>
@@ -930,7 +930,7 @@
         <w:t xml:space="preserve">Existing survey quality assurance methods are limited in their ability to detect complex patterns </w:t>
       </w:r>
       <w:r>
-        <w:t xml:space="preserve">of poor data collection. Most approaches rely on simple aggregate metrics — primarily total interview duration — that do not adequately capture </w:t>
+        <w:t xml:space="preserve">of poor data collection. Most approaches rely on simple aggregate metrics, primarily total interview duration, that do not adequately capture </w:t>
       </w:r>
       <w:r>
         <w:t>behavioral</w:t>
@@ -1358,7 +1358,7 @@
         <w:t xml:space="preserve">Yan and Tourangeau [5] directly examined response latency as a quality indicator, finding </w:t>
       </w:r>
       <w:r>
-        <w:t>that question complexity, respondent age, and familiarity with topic all predicted response time variation. Their work identified mean response latency and within-respondent latency variance as particularly discriminative features — questions answered unus</w:t>
+        <w:t>that question complexity, respondent age, and familiarity with topic all predicted response time variation. Their work identified mean response latency and within-respondent latency variance as particularly discriminative features, questions answered unus</w:t>
       </w:r>
       <w:r>
         <w:t>ually quickly relative to their complexity profile are associated with reduced cognitive engagement and lower data quality. This finding directly motivates the inclusion of question-level response time, time-to-first-interaction, and complexity-adjusted pa</w:t>
@@ -1379,7 +1379,7 @@
         <w:t>behavioral</w:t>
       </w:r>
       <w:r>
-        <w:t xml:space="preserve"> signals — including extended pauses and repeated back-navigation — could identify respondent d</w:t>
+        <w:t xml:space="preserve"> signals, including extended pauses and repeated back-navigation, could identify respondent d</w:t>
       </w:r>
       <w:r>
         <w:t>ifficulty and trigger adaptive interventions. Their analysis underscored the relevance of section-level pause frequency, within-section timing variance, and back-navigation rate as indicators of processing difficulty or disengagement.</w:t>
@@ -1405,7 +1405,7 @@
         <w:t>, and Janke [6], who investigated data fabrication detection using paradata in the context of face-to-face interviewer-administered surveys. They found that fabricated interviews exhibi</w:t>
       </w:r>
       <w:r>
-        <w:t>ted characteristically compressed response time distributions — notably reduced inter-quartile spread and lower variance in question-level durations — along with abnormally low back-navigation counts and unusually uniform section pace. These findings estab</w:t>
+        <w:t>ted characteristically compressed response time distributions, notably reduced inter-quartile spread and lower variance in question-level durations, along with abnormally low back-navigation counts and unusually uniform section pace. These findings estab</w:t>
       </w:r>
       <w:r>
         <w:t>lish the statistical basis for the anomaly detection component of this project and directly inform the selection of IQR-based thresholding as a detection method.</w:t>
@@ -1431,7 +1431,7 @@
         <w:t>programs</w:t>
       </w:r>
       <w:r>
-        <w:t>. A recurring finding is that computational processing of timing data requires platform-specific parsing strategies before any analytical features can be extracted — a practical challenge that motivat</w:t>
+        <w:t>. A recurring finding is that computational processing of timing data requires platform-specific parsing strategies before any analytical features can be extracted, a practical challenge that motivat</w:t>
       </w:r>
       <w:r>
         <w:t xml:space="preserve">es the parser development component of this project. Survey-level features such as total interview duration, speed trajectory across the interview, and time-of-day effects are identified by </w:t>
@@ -2138,13 +2138,13 @@
         <w:t>normalize</w:t>
       </w:r>
       <w:r>
-        <w:t xml:space="preserve"> each format into a common intermediate representation — a structured event table with </w:t>
+        <w:t xml:space="preserve"> each format into a common intermediate representation, a structured event table with </w:t>
       </w:r>
       <w:r>
         <w:t>standardized</w:t>
       </w:r>
       <w:r>
-        <w:t xml:space="preserve"> columns for interview ID, field name, event type, and timestamp — enabling all dow</w:t>
+        <w:t xml:space="preserve"> columns for interview ID, field name, event type, and timestamp, enabling all dow</w:t>
       </w:r>
       <w:r>
         <w:t>nstream processing to operate on a single data model.</w:t>
@@ -2162,7 +2162,7 @@
         <w:t>eld, time-to-first-interaction, edit count, and whether the field was revisited. At the section level, it aggregates section pace, within-section timing variance, pause frequency, and pause duration. At the survey level, it computes total interview duratio</w:t>
       </w:r>
       <w:r>
-        <w:t xml:space="preserve">n, speed trajectory across the interview arc, back-navigation rate, and time-of-day flags. Statistical measures — including variance, entropy, skewness, and kurtosis — </w:t>
+        <w:t xml:space="preserve">n, speed trajectory across the interview arc, back-navigation rate, and time-of-day flags. Statistical measures, including variance, entropy, skewness, and kurtosis, </w:t>
       </w:r>
       <w:r>
         <w:t>characterize</w:t>
@@ -8168,7 +8168,7 @@
         <w:t>g., form-start, form-resume, constraint, end), node (the XPath field identifier), and start/end timestamps in epoch milliseconds. ODK audit logs record event, node, and start/end fields in a broadly similar CSV structure, but with a different event taxonom</w:t>
       </w:r>
       <w:r>
-        <w:t>y — using terms such as question rather than field-specific events — and timestamps in ISO 8601 format rather than epoch milliseconds.</w:t>
+        <w:t>y, using terms such as question rather than field-specific events, and timestamps in ISO 8601 format rather than epoch milliseconds.</w:t>
       </w:r>
     </w:p>
     <w:p>
@@ -8379,7 +8379,7 @@
         <w:spacing w:before="40" w:after="40"/>
       </w:pPr>
       <w:r>
-        <w:t>Inconsistent timing patterns relative to question complexity — specifically, uniformly fast responses irrespective of question length or type</w:t>
+        <w:t>Inconsistent timing patterns relative to question complexity, specifically, uniformly fast responses irrespective of question length or type</w:t>
       </w:r>
     </w:p>
     <w:p>
@@ -8399,7 +8399,7 @@
         <w:t>es. Statistical flagging applies IQR-based thresholding: for each timing feature, interviews with values below Q1 - 1.5 × IQR or above Q3 + 1.5 × IQR are flagged as potential anomalies. This is consistent with the fabrication detection approach validated b</w:t>
       </w:r>
       <w:r>
-        <w:t>y Wenz et al. [6], whose key discriminative features — compressed response time IQR and low back-navigation — are directly captured in the feature taxonomy.</w:t>
+        <w:t>y Wenz et al. [6], whose key discriminative features, compressed response time IQR and low back-navigation, are directly captured in the feature taxonomy.</w:t>
       </w:r>
     </w:p>
     <w:p>
@@ -10832,7 +10832,7 @@
         <w:t>The feature taxonomy, whi</w:t>
       </w:r>
       <w:r>
-        <w:t>le informed by the literature, is preliminary. Some features may prove non-discriminative in practice, and format-specific constraints — particularly in ODK's coarser timing granularity — may limit the computability of certain question-level features.</w:t>
+        <w:t>le informed by the literature, is preliminary. Some features may prove non-discriminative in practice, and format-specific constraints, particularly in ODK's coarser timing granularity, may limit the computability of certain question-level features.</w:t>
       </w:r>
     </w:p>
     <w:p>

</xml_diff>